<commit_message>
added python code file
</commit_message>
<xml_diff>
--- a/Chapter-1/Lesson-1/codes.docx
+++ b/Chapter-1/Lesson-1/codes.docx
@@ -5,6 +5,9 @@
     <w:p>
       <w:r>
         <w:t>https://colab.research.google.com/drive/1tH1hD4hUiNuzXJ3Im2qKb3AS9X7BSDI4#scrollTo=TwprhkSt3Z2q</w:t>
+      </w:r>
+      <w:r>
+        <w:t xml:space="preserve"> </w:t>
       </w:r>
     </w:p>
     <w:sectPr>
@@ -934,6 +937,29 @@
       <w:spacing w:val="5"/>
     </w:rPr>
   </w:style>
+  <w:style w:type="character" w:styleId="Hyperlink">
+    <w:name w:val="Hyperlink"/>
+    <w:basedOn w:val="DefaultParagraphFont"/>
+    <w:uiPriority w:val="99"/>
+    <w:unhideWhenUsed/>
+    <w:rsid w:val="006D452A"/>
+    <w:rPr>
+      <w:color w:val="0563C1" w:themeColor="hyperlink"/>
+      <w:u w:val="single"/>
+    </w:rPr>
+  </w:style>
+  <w:style w:type="character" w:styleId="UnresolvedMention">
+    <w:name w:val="Unresolved Mention"/>
+    <w:basedOn w:val="DefaultParagraphFont"/>
+    <w:uiPriority w:val="99"/>
+    <w:semiHidden/>
+    <w:unhideWhenUsed/>
+    <w:rsid w:val="006D452A"/>
+    <w:rPr>
+      <w:color w:val="605E5C"/>
+      <w:shd w:val="clear" w:color="auto" w:fill="E1DFDD"/>
+    </w:rPr>
+  </w:style>
 </w:styles>
 </file>
 

</xml_diff>